<commit_message>
Update dissertation and teaching artifacts
</commit_message>
<xml_diff>
--- a/dist/outputs/BAB_V_HEADING_SUBHEADING.docx
+++ b/dist/outputs/BAB_V_HEADING_SUBHEADING.docx
@@ -201,6 +201,15 @@
         </w:rPr>
         <w:t>Kelayakan media menunjukkan hasil yang sangat baik. Validasi ahli materi memperoleh persentase 97,50%, validasi ahli media 92,22%, dan validasi gabungan 95,74%. Dari sisi pengguna, respons mahasiswa pada tahap uji coba juga menunjukkan penerimaan yang positif. Dengan demikian, media yang dikembangkan dapat dipandang layak untuk diujicobakan dan digunakan dalam pembelajaran dengan revisi terbatas, walaupun beberapa aspek teknis, seperti stabilitas akses dan kemudahan penggunaan pada perangkat bergerak, masih memerlukan penyempurnaan.</w:t>
       </w:r>
+      <w:bookmarkEnd w:id="1"/>
+      <w:r>
+        <w:rPr>
+          <w:rFonts w:ascii="Times New Roman" w:hAnsi="Times New Roman"/>
+          <w:sz w:val="24"/>
+          <w:szCs w:val="24"/>
+        </w:rPr>
+        <w:t xml:space="preserve"> </w:t>
+      </w:r>
     </w:p>
     <w:p>
       <w:pPr>
@@ -221,153 +230,8 @@
           <w:sz w:val="24"/>
           <w:szCs w:val="24"/>
         </w:rPr>
-        <w:t xml:space="preserve">Pada uji lapangan, kelompok eksperimen menunjukkan peningkatan yang lebih tinggi dibandingkan kelompok kontrol, baik pada kemampuan metakognitif maupun keterampilan berbicara. Rerata </w:t>
-      </w:r>
-      <w:r>
-        <w:rPr>
-          <w:rFonts w:ascii="Times New Roman" w:hAnsi="Times New Roman"/>
-          <w:i/>
-          <w:iCs/>
-          <w:sz w:val="24"/>
-          <w:szCs w:val="24"/>
-        </w:rPr>
-        <w:t>N-gain</w:t>
-      </w:r>
-      <w:r>
-        <w:rPr>
-          <w:rFonts w:ascii="Times New Roman" w:hAnsi="Times New Roman"/>
-          <w:sz w:val="24"/>
-          <w:szCs w:val="24"/>
-        </w:rPr>
-        <w:t xml:space="preserve"> kemampuan metakognitif pada kelompok eksperimen mencapai 0,648, sedangkan pada kelompok kontrol 0,400. Pada keterampilan berbicara, rerata </w:t>
-      </w:r>
-      <w:r>
-        <w:rPr>
-          <w:rFonts w:ascii="Times New Roman" w:hAnsi="Times New Roman"/>
-          <w:i/>
-          <w:iCs/>
-          <w:sz w:val="24"/>
-          <w:szCs w:val="24"/>
-        </w:rPr>
-        <w:t>N-gain</w:t>
-      </w:r>
-      <w:r>
-        <w:rPr>
-          <w:rFonts w:ascii="Times New Roman" w:hAnsi="Times New Roman"/>
-          <w:sz w:val="24"/>
-          <w:szCs w:val="24"/>
-        </w:rPr>
-        <w:t xml:space="preserve"> kelompok eksperimen mencapai 0,375, sedangkan kelompok kontrol 0,284. Hasil uji beda mendukung bahwa perbedaan peningkatan tersebut bermakna secara statistik. Secara substantif, peningkatan pada kelompok eksperimen tampak pada penguatan lima dimensi kemampuan metakognitif, yakni </w:t>
-      </w:r>
-      <w:r>
-        <w:rPr>
-          <w:rFonts w:ascii="Times New Roman" w:hAnsi="Times New Roman"/>
-          <w:i/>
-          <w:iCs/>
-          <w:sz w:val="24"/>
-          <w:szCs w:val="24"/>
-        </w:rPr>
-        <w:t xml:space="preserve">conceptualisation, </w:t>
-      </w:r>
-      <w:r>
-        <w:rPr>
-          <w:rFonts w:ascii="Times New Roman" w:hAnsi="Times New Roman"/>
-          <w:sz w:val="24"/>
-          <w:szCs w:val="24"/>
-        </w:rPr>
-        <w:t>formulation</w:t>
-      </w:r>
-      <w:r>
-        <w:rPr>
-          <w:rFonts w:ascii="Times New Roman" w:hAnsi="Times New Roman"/>
-          <w:i/>
-          <w:iCs/>
-          <w:sz w:val="24"/>
-          <w:szCs w:val="24"/>
-        </w:rPr>
-        <w:t xml:space="preserve">, </w:t>
-      </w:r>
-      <w:r>
-        <w:rPr>
-          <w:rFonts w:ascii="Times New Roman" w:hAnsi="Times New Roman"/>
-          <w:sz w:val="24"/>
-          <w:szCs w:val="24"/>
-        </w:rPr>
-        <w:t>articulation</w:t>
-      </w:r>
-      <w:r>
-        <w:rPr>
-          <w:rFonts w:ascii="Times New Roman" w:hAnsi="Times New Roman"/>
-          <w:i/>
-          <w:iCs/>
-          <w:sz w:val="24"/>
-          <w:szCs w:val="24"/>
-        </w:rPr>
-        <w:t xml:space="preserve">, </w:t>
-      </w:r>
-      <w:r>
-        <w:rPr>
-          <w:rFonts w:ascii="Times New Roman" w:hAnsi="Times New Roman"/>
-          <w:sz w:val="24"/>
-          <w:szCs w:val="24"/>
-        </w:rPr>
-        <w:t>self-monitoring</w:t>
-      </w:r>
-      <w:r>
-        <w:rPr>
-          <w:rFonts w:ascii="Times New Roman" w:hAnsi="Times New Roman"/>
-          <w:i/>
-          <w:iCs/>
-          <w:sz w:val="24"/>
-          <w:szCs w:val="24"/>
-        </w:rPr>
-        <w:t>,</w:t>
-      </w:r>
-      <w:r>
-        <w:rPr>
-          <w:rFonts w:ascii="Times New Roman" w:hAnsi="Times New Roman"/>
-          <w:sz w:val="24"/>
-          <w:szCs w:val="24"/>
-        </w:rPr>
-        <w:t xml:space="preserve"> dan </w:t>
-      </w:r>
-      <w:r>
-        <w:rPr>
-          <w:rFonts w:ascii="Times New Roman" w:hAnsi="Times New Roman"/>
-          <w:i/>
-          <w:iCs/>
-          <w:sz w:val="24"/>
-          <w:szCs w:val="24"/>
-        </w:rPr>
-        <w:t>self-evaluation</w:t>
-      </w:r>
-      <w:r>
-        <w:rPr>
-          <w:rFonts w:ascii="Times New Roman" w:hAnsi="Times New Roman"/>
-          <w:sz w:val="24"/>
-          <w:szCs w:val="24"/>
-        </w:rPr>
-        <w:t xml:space="preserve">, yang tercermin dalam kebiasaan menata isi, merumuskan penjelasan, menjaga kejelasan ujaran, memantau performa, dan mengevaluasi hasil berbicara. Namun, hubungan kuantitatif antara skor metakognitif dan skor keterampilan berbicara pada pengukuran akhir cenderung lemah. Oleh karena itu, kontribusi media dalam penelitian ini lebih tepat dipahami melalui proses belajar yang muncul selama implementasi, seperti kebiasaan menyusun kerangka, menjelaskan ulang, menggunakan </w:t>
-      </w:r>
-      <w:r>
-        <w:rPr>
-          <w:rFonts w:ascii="Times New Roman" w:hAnsi="Times New Roman"/>
-          <w:i/>
-          <w:iCs/>
-          <w:sz w:val="24"/>
-          <w:szCs w:val="24"/>
-        </w:rPr>
-        <w:t>playback</w:t>
-      </w:r>
-      <w:r>
-        <w:rPr>
-          <w:rFonts w:ascii="Times New Roman" w:hAnsi="Times New Roman"/>
-          <w:sz w:val="24"/>
-          <w:szCs w:val="24"/>
-        </w:rPr>
-        <w:t>, dan merefleksikan performa berbicara.</w:t>
-      </w:r>
-      <w:bookmarkEnd w:id="1"/>
+        <w:t>Pada uji lapangan, kelompok eksperimen menunjukkan peningkatan yang lebih tinggi dibandingkan kelompok kontrol, baik pada kemampuan metakognitif maupun keterampilan berbicara. Rerata N-gain kemampuan metakognitif pada kelompok eksperimen mencapai 0,648, sedangkan pada kelompok kontrol 0,400. Pada keterampilan berbicara, rerata N-gain kelompok eksperimen mencapai 0,375, sedangkan kelompok kontrol 0,284. Hasil uji beda mendukung bahwa perbedaan peningkatan tersebut bermakna secara statistik.  Secara substantif, peningkatan pada kelompok eksperimen tampak pada penguatan lima dimensi kemampuan metakognitif, yakni conceptualisation, formulation, articulation, self-monitoring, dan self-evaluation, yang tercermin dalam kebiasaan menata isi, merumuskan penjelasan, menjaga kejelasan ujaran, memantau performa, dan mengevaluasi hasil berbicara. Namun, hubungan kuantitatif antara skor metakognitif dan skor keterampilan berbicara pada pengukuran akhir cenderung lemah. Oleh karena itu, kontribusi media dalam penelitian ini lebih tepat dipahami melalui proses belajar yang muncul selama implementasi, seperti kebiasaan menyusun kerangka, menjelaskan ulang, menggunakan playback, dan merefleksikan performa berbicara.</w:t>
+      </w:r>
     </w:p>
     <w:p>
       <w:pPr>

</xml_diff>